<commit_message>
added neue Präsentation zur Bearbeitung
</commit_message>
<xml_diff>
--- a/Resources/READ ME PRÄSENTATION.docx
+++ b/Resources/READ ME PRÄSENTATION.docx
@@ -38,23 +38,7 @@
           <w:b/>
           <w:bCs/>
         </w:rPr>
-        <w:t xml:space="preserve">Kontaktlose Vitalzeichenmessung mit </w:t>
-      </w:r>
-      <w:proofErr w:type="spellStart"/>
-      <w:r>
-        <w:rPr>
-          <w:b/>
-          <w:bCs/>
-        </w:rPr>
-        <w:t>mmWave</w:t>
-      </w:r>
-      <w:proofErr w:type="spellEnd"/>
-      <w:r>
-        <w:rPr>
-          <w:b/>
-          <w:bCs/>
-        </w:rPr>
-        <w:t>-Radar</w:t>
+        <w:t>Kontaktlose Vitalzeichenmessung mit mmWave-Radar</w:t>
       </w:r>
     </w:p>
     <w:p>
@@ -70,15 +54,7 @@
         </w:numPr>
       </w:pPr>
       <w:r>
-        <w:t xml:space="preserve">Python-basierte Analyse von </w:t>
-      </w:r>
-      <w:proofErr w:type="spellStart"/>
-      <w:r>
-        <w:t>mmWave</w:t>
-      </w:r>
-      <w:proofErr w:type="spellEnd"/>
-      <w:r>
-        <w:t xml:space="preserve">-Radardaten </w:t>
+        <w:t xml:space="preserve">Python-basierte Analyse von mmWave-Radardaten </w:t>
       </w:r>
     </w:p>
     <w:p>
@@ -120,21 +96,13 @@
       </w:r>
       <w:r>
         <w:br/>
-        <w:t xml:space="preserve">Führen Sie das Thema als Projekt zur kontaktlosen Vitalzeichenmessung mit </w:t>
-      </w:r>
-      <w:proofErr w:type="spellStart"/>
-      <w:r>
-        <w:t>mmWave</w:t>
-      </w:r>
-      <w:proofErr w:type="spellEnd"/>
-      <w:r>
-        <w:t>-Radar ein. Erklären Sie, dass für das Projekt auch das Verständnis der Radarhardware und der korrekten Radarkonfiguration notwendig war, weil nutzbare Rohdaten stark vom Messaufbau abhängen. Die Radarhardware und Konfiguration sind jedoch nicht der eigentliche eigene Hauptbeitrag der Arbeit. Sie bilden die Grundlage für die Datenerfassung, während der eigene Schwerpunkt auf der Python-Verarbeitungskette liegt, die aufgezeichnete Radardaten in Atemfrequenz- und Herzfrequenz-Schätzungen umwandelt.</w:t>
+        <w:t>Führen Sie das Thema als Projekt zur kontaktlosen Vitalzeichenmessung mit mmWave-Radar ein. Erklären Sie, dass für das Projekt auch das Verständnis der Radarhardware und der korrekten Radarkonfiguration notwendig war, weil nutzbare Rohdaten stark vom Messaufbau abhängen. Die Radarhardware und Konfiguration sind jedoch nicht der eigentliche eigene Hauptbeitrag der Arbeit. Sie bilden die Grundlage für die Datenerfassung, während der eigene Schwerpunkt auf der Python-Verarbeitungskette liegt, die aufgezeichnete Radardaten in Atemfrequenz- und Herzfrequenz-Schätzungen umwandelt.</w:t>
       </w:r>
     </w:p>
     <w:p>
       <w:r>
         <w:pict w14:anchorId="78B9AB51">
-          <v:rect id="_x0000_i1115" style="width:0;height:1.5pt" o:hralign="center" o:hrstd="t" o:hr="t" fillcolor="#a0a0a0" stroked="f"/>
+          <v:rect id="_x0000_i1025" style="width:0;height:1.5pt" o:hralign="center" o:hrstd="t" o:hr="t" fillcolor="#a0a0a0" stroked="f"/>
         </w:pict>
       </w:r>
     </w:p>
@@ -239,22 +207,31 @@
       </w:r>
       <w:r>
         <w:br/>
-        <w:t>Beginnen Sie den eigentlichen Vortrag mit der Motivation. Erklären Sie, dass Elektroden, Gurte und tragbare Sensoren nützlich sind, aber nicht immer praktikabel. Bei Brandopfern, fragilen Patienten oder in Isolationsumgebungen kann es ein großer Vorteil sein, physischen Kontakt zu vermeiden.</w:t>
-      </w:r>
-    </w:p>
-    <w:p>
-      <w:r>
-        <w:t xml:space="preserve">Erwähnen Sie außerdem das breitere Überwachungspotenzial: Ein kontaktloses Radarsystem könnte in Wartezimmern, Pflegebereichen oder Beobachtungsräumen als Frühwarnsystem eingesetzt werden. Es </w:t>
+        <w:t>Elektroden, Gurte und tragbare Sensoren sind</w:t>
+      </w:r>
+      <w:r>
+        <w:t xml:space="preserve"> nützlich</w:t>
+      </w:r>
+      <w:r>
+        <w:t>, aber nicht immer praktikabel. Bei Brandopfern, fragilen Patienten oder in Isolationsumgebungen kann es ein großer Vorteil sein, physischen Kontakt zu vermeiden.</w:t>
+      </w:r>
+    </w:p>
+    <w:p>
+      <w:r>
+        <w:t>B</w:t>
+      </w:r>
+      <w:r>
+        <w:t xml:space="preserve">reitere Überwachungspotenzial: Ein kontaktloses Radarsystem könnte in Wartezimmern, Pflegebereichen oder Beobachtungsräumen als Frühwarnsystem eingesetzt werden. Es würde keine </w:t>
       </w:r>
       <w:r>
         <w:lastRenderedPageBreak/>
-        <w:t>würde keine klinische Diagnose ersetzen, könnte aber helfen, auffälliges Atem- oder Herzfrequenzverhalten früher zu erkennen, insbesondere wenn Patienten nicht dauerhaft an konventionelle Überwachungsgeräte angeschlossen sind.</w:t>
+        <w:t>klinische Diagnose ersetzen, könnte aber helfen, auffälliges Atem- oder Herzfrequenzverhalten früher zu erkennen, insbesondere wenn Patienten nicht dauerhaft an konventionelle Überwachungsgeräte angeschlossen sind.</w:t>
       </w:r>
     </w:p>
     <w:p>
       <w:r>
         <w:pict w14:anchorId="05EE3465">
-          <v:rect id="_x0000_i1116" style="width:0;height:1.5pt" o:hralign="center" o:hrstd="t" o:hr="t" fillcolor="#a0a0a0" stroked="f"/>
+          <v:rect id="_x0000_i1026" style="width:0;height:1.5pt" o:hralign="center" o:hrstd="t" o:hr="t" fillcolor="#a0a0a0" stroked="f"/>
         </w:pict>
       </w:r>
     </w:p>
@@ -306,15 +283,7 @@
         </w:numPr>
       </w:pPr>
       <w:r>
-        <w:t xml:space="preserve">Mit unseren </w:t>
-      </w:r>
-      <w:proofErr w:type="spellStart"/>
-      <w:r>
-        <w:t>Chirp</w:t>
-      </w:r>
-      <w:proofErr w:type="spellEnd"/>
-      <w:r>
-        <w:t xml:space="preserve">-Einstellungen beträgt die Entfernungsauflösung etwa </w:t>
+        <w:t xml:space="preserve">Mit unseren Chirp-Einstellungen beträgt die Entfernungsauflösung etwa </w:t>
       </w:r>
       <w:r>
         <w:rPr>
@@ -397,23 +366,13 @@
       </w:r>
       <w:r>
         <w:br/>
-        <w:t xml:space="preserve">Erklären Sie den Unterschied zwischen normaler Radar-Abstandsmessung und phasenbasierter Vitalzeichenmessung. Bei regulärer Radarverarbeitung werden Objekte in Entfernungsbereiche eingeteilt. Die Auflösung hängt hauptsächlich von der verwendeten </w:t>
-      </w:r>
-      <w:proofErr w:type="spellStart"/>
-      <w:r>
-        <w:t>Chirp</w:t>
-      </w:r>
-      <w:proofErr w:type="spellEnd"/>
-      <w:r>
-        <w:t xml:space="preserve">-Bandbreite ab. Mit der Projektkonfiguration startet der </w:t>
-      </w:r>
-      <w:proofErr w:type="spellStart"/>
-      <w:r>
-        <w:t>Chirp</w:t>
-      </w:r>
-      <w:proofErr w:type="spellEnd"/>
-      <w:r>
-        <w:t xml:space="preserve"> bei 77 GHz und nutzt ungefähr 1,8 GHz Bandbreite, was zu einer Entfernungsauflösung von etwa 83 mm führt. Zwei Objekte, die näher beieinander liegen, sind damit allein über die normale Entfernungsverarbeitung schwer zu trennen.</w:t>
+        <w:t>Bei regulärer Radarverarbeitung werden Objekte in Entfernungsbereiche eingeteilt. Die Auflösung hängt hauptsächlich von der verwendeten Chirp-Bandbreite ab. Mit der Projektkonfiguration startet der Chirp bei 77 GHz und nutzt ungefähr 1,8 GHz Bandbreite, was zu einer Entfernungsauflösung von etwa 83 mm führt. Zwei Objekte, die näher beieinander liegen, sind damit allein über die normale</w:t>
+      </w:r>
+      <w:r>
+        <w:t xml:space="preserve"> </w:t>
+      </w:r>
+      <w:r>
+        <w:t>Entfernungsverarbeitung schwer zu trennen.</w:t>
       </w:r>
     </w:p>
     <w:p>
@@ -429,7 +388,7 @@
     <w:p>
       <w:r>
         <w:pict w14:anchorId="1E5CC4CF">
-          <v:rect id="_x0000_i1117" style="width:0;height:1.5pt" o:hralign="center" o:hrstd="t" o:hr="t" fillcolor="#a0a0a0" stroked="f"/>
+          <v:rect id="_x0000_i1027" style="width:0;height:1.5pt" o:hralign="center" o:hrstd="t" o:hr="t" fillcolor="#a0a0a0" stroked="f"/>
         </w:pict>
       </w:r>
     </w:p>
@@ -440,13 +399,37 @@
           <w:bCs/>
         </w:rPr>
       </w:pPr>
+    </w:p>
+    <w:p>
+      <w:pPr>
+        <w:rPr>
+          <w:b/>
+          <w:bCs/>
+        </w:rPr>
+      </w:pPr>
       <w:r>
         <w:rPr>
           <w:b/>
           <w:bCs/>
         </w:rPr>
         <w:lastRenderedPageBreak/>
-        <w:t>4. Algorithmus-Gesamtübersicht</w:t>
+        <w:t xml:space="preserve">4. </w:t>
+      </w:r>
+      <w:r>
+        <w:rPr>
+          <w:b/>
+          <w:bCs/>
+          <w:color w:val="C45911" w:themeColor="accent2" w:themeShade="BF"/>
+        </w:rPr>
+        <w:t>Algorithmus-Gesamtübersicht</w:t>
+      </w:r>
+      <w:r>
+        <w:rPr>
+          <w:b/>
+          <w:bCs/>
+          <w:color w:val="C45911" w:themeColor="accent2" w:themeShade="BF"/>
+        </w:rPr>
+        <w:t xml:space="preserve"> (ausgeblendet)</w:t>
       </w:r>
     </w:p>
     <w:p>
@@ -679,15 +662,7 @@
           </w:tcPr>
           <w:p>
             <w:r>
-              <w:t xml:space="preserve">Messparameter wie Samples, </w:t>
-            </w:r>
-            <w:proofErr w:type="spellStart"/>
-            <w:r>
-              <w:t>Chirps</w:t>
-            </w:r>
-            <w:proofErr w:type="spellEnd"/>
-            <w:r>
-              <w:t>, Frames, Empfangskanäle und Timing</w:t>
+              <w:t>Messparameter wie Samples, Chirps, Frames, Empfangskanäle und Timing</w:t>
             </w:r>
           </w:p>
         </w:tc>
@@ -858,15 +833,7 @@
           </w:tcPr>
           <w:p>
             <w:r>
-              <w:t xml:space="preserve">Ausgewählte Person / Region </w:t>
-            </w:r>
-            <w:proofErr w:type="spellStart"/>
-            <w:r>
-              <w:t>of</w:t>
-            </w:r>
-            <w:proofErr w:type="spellEnd"/>
-            <w:r>
-              <w:t xml:space="preserve"> Interest für Vitalzeichenextraktion</w:t>
+              <w:t>Ausgewählte Person / Region of Interest für Vitalzeichenextraktion</w:t>
             </w:r>
           </w:p>
         </w:tc>
@@ -911,15 +878,7 @@
           </w:tcPr>
           <w:p>
             <w:r>
-              <w:t xml:space="preserve">Radarsignal aus der ausgewählten Region </w:t>
-            </w:r>
-            <w:proofErr w:type="spellStart"/>
-            <w:r>
-              <w:t>of</w:t>
-            </w:r>
-            <w:proofErr w:type="spellEnd"/>
-            <w:r>
-              <w:t xml:space="preserve"> Interest</w:t>
+              <w:t>Radarsignal aus der ausgewählten Region of Interest</w:t>
             </w:r>
           </w:p>
         </w:tc>
@@ -1123,6 +1082,7 @@
                 <w:b/>
                 <w:bCs/>
               </w:rPr>
+              <w:lastRenderedPageBreak/>
               <w:t>Finale Visualisierung</w:t>
             </w:r>
           </w:p>
@@ -1147,28 +1107,19 @@
           </w:tcPr>
           <w:p>
             <w:r>
-              <w:t xml:space="preserve">Geschätzte Frequenzen und </w:t>
-            </w:r>
-            <w:r>
-              <w:lastRenderedPageBreak/>
-              <w:t>verarbeitete Signale</w:t>
-            </w:r>
-          </w:p>
-        </w:tc>
-        <w:tc>
-          <w:tcPr>
-            <w:tcW w:w="0" w:type="auto"/>
-            <w:vAlign w:val="center"/>
-            <w:hideMark/>
-          </w:tcPr>
-          <w:p>
-            <w:r>
-              <w:lastRenderedPageBreak/>
-              <w:t xml:space="preserve">Dashboard mit der </w:t>
-            </w:r>
-            <w:r>
-              <w:lastRenderedPageBreak/>
-              <w:t>finalen Vitalzeichenanalyse</w:t>
+              <w:t>Geschätzte Frequenzen und verarbeitete Signale</w:t>
+            </w:r>
+          </w:p>
+        </w:tc>
+        <w:tc>
+          <w:tcPr>
+            <w:tcW w:w="0" w:type="auto"/>
+            <w:vAlign w:val="center"/>
+            <w:hideMark/>
+          </w:tcPr>
+          <w:p>
+            <w:r>
+              <w:t>Dashboard mit der finalen Vitalzeichenanalyse</w:t>
             </w:r>
           </w:p>
         </w:tc>
@@ -1189,7 +1140,6 @@
                 <w:b/>
                 <w:bCs/>
               </w:rPr>
-              <w:lastRenderedPageBreak/>
               <w:t>Gemeinsame Hilfsfunktionen</w:t>
             </w:r>
           </w:p>
@@ -1233,23 +1183,42 @@
       </w:tr>
     </w:tbl>
     <w:p>
-      <w:r>
+      <w:pPr>
+        <w:rPr>
+          <w:color w:val="C45911" w:themeColor="accent2" w:themeShade="BF"/>
+        </w:rPr>
+      </w:pPr>
+      <w:r>
+        <w:rPr>
+          <w:color w:val="C45911" w:themeColor="accent2" w:themeShade="BF"/>
+        </w:rPr>
         <w:t>Sprechernotizen:</w:t>
       </w:r>
       <w:r>
+        <w:rPr>
+          <w:color w:val="C45911" w:themeColor="accent2" w:themeShade="BF"/>
+        </w:rPr>
         <w:br/>
         <w:t>Nutzen Sie diese Folie als technische Roadmap. Die erste Spalte beschreibt das algorithmische Modul, während die zweite Spalte zeigt, in welcher Python-Datei die jeweilige Funktionalität umgesetzt ist. Einige Verarbeitungsschritte sind direkt einem Python-Modul zugeordnet, zum Beispiel die Rohdatenrekonstruktion in adc_parser.py oder die Entfernungsverarbeitung in range_processing.py. Andere Schritte sind in einem gemeinsamen Implementierungsmodul zusammengefasst. In diesem Projekt sind Phasenextraktion, Bewegungsrekonstruktion, Filterung und Frequenzschätzung alle in vital_processing.py implementiert.</w:t>
       </w:r>
     </w:p>
     <w:p>
-      <w:r>
+      <w:pPr>
+        <w:rPr>
+          <w:color w:val="C45911" w:themeColor="accent2" w:themeShade="BF"/>
+        </w:rPr>
+      </w:pPr>
+      <w:r>
+        <w:rPr>
+          <w:color w:val="C45911" w:themeColor="accent2" w:themeShade="BF"/>
+        </w:rPr>
         <w:t>Das Hauptskript ADC_To_Vital_Signs.py koordiniert die komplette Pipeline. Es ruft die einzelnen Module nacheinander auf und übergibt jedes Zwischenergebnis an den nächsten Verarbeitungsschritt. Dadurch wird deutlich, dass die Pipeline nicht nur ein großes Skript ist, sondern eine strukturierte Verarbeitungskette mit definierten Eingängen, Zwischenergebnissen und Ausgaben.</w:t>
       </w:r>
     </w:p>
     <w:p>
       <w:r>
         <w:pict w14:anchorId="67F702ED">
-          <v:rect id="_x0000_i1118" style="width:0;height:1.5pt" o:hralign="center" o:hrstd="t" o:hr="t" fillcolor="#a0a0a0" stroked="f"/>
+          <v:rect id="_x0000_i1028" style="width:0;height:1.5pt" o:hralign="center" o:hrstd="t" o:hr="t" fillcolor="#a0a0a0" stroked="f"/>
         </w:pict>
       </w:r>
     </w:p>
@@ -1274,23 +1243,7 @@
           <w:b/>
           <w:bCs/>
         </w:rPr>
-        <w:t xml:space="preserve">Von </w:t>
-      </w:r>
-      <w:proofErr w:type="spellStart"/>
-      <w:r>
-        <w:rPr>
-          <w:b/>
-          <w:bCs/>
-        </w:rPr>
-        <w:t>mmWave</w:t>
-      </w:r>
-      <w:proofErr w:type="spellEnd"/>
-      <w:r>
-        <w:rPr>
-          <w:b/>
-          <w:bCs/>
-        </w:rPr>
-        <w:t>-Studio-Ausgabe zu strukturierten Radar-Frames</w:t>
+        <w:t>Von mmWave-Studio-Ausgabe zu strukturierten Radar-Frames</w:t>
       </w:r>
     </w:p>
     <w:p>
@@ -1305,13 +1258,8 @@
           <w:numId w:val="4"/>
         </w:numPr>
       </w:pPr>
-      <w:proofErr w:type="spellStart"/>
-      <w:r>
-        <w:t>mmWave</w:t>
-      </w:r>
-      <w:proofErr w:type="spellEnd"/>
-      <w:r>
-        <w:t xml:space="preserve"> Studio kann rohe ADC-Dateien mit unterschiedlichen Radarkonfigurationen erzeugen </w:t>
+      <w:r>
+        <w:t xml:space="preserve">mmWave Studio kann rohe ADC-Dateien mit unterschiedlichen Radarkonfigurationen erzeugen </w:t>
       </w:r>
     </w:p>
     <w:p>
@@ -1333,15 +1281,7 @@
         </w:numPr>
       </w:pPr>
       <w:r>
-        <w:t xml:space="preserve">Rohe Binärdaten werden in Frames, </w:t>
-      </w:r>
-      <w:proofErr w:type="spellStart"/>
-      <w:r>
-        <w:t>Chirps</w:t>
-      </w:r>
-      <w:proofErr w:type="spellEnd"/>
-      <w:r>
-        <w:t xml:space="preserve">, Empfangskanäle und ADC-Samples umgeformt </w:t>
+        <w:t xml:space="preserve">Rohe Binärdaten werden in Frames, Chirps, Empfangskanäle und ADC-Samples umgeformt </w:t>
       </w:r>
     </w:p>
     <w:p>
@@ -1424,6 +1364,7 @@
                 <w:b/>
                 <w:bCs/>
               </w:rPr>
+              <w:lastRenderedPageBreak/>
               <w:t>Parameter</w:t>
             </w:r>
           </w:p>
@@ -1463,7 +1404,6 @@
           </w:tcPr>
           <w:p>
             <w:r>
-              <w:lastRenderedPageBreak/>
               <w:t>Startfrequenz</w:t>
             </w:r>
           </w:p>
@@ -1493,13 +1433,8 @@
           </w:tcPr>
           <w:p>
             <w:r>
-              <w:t xml:space="preserve">ADC-Samples pro </w:t>
-            </w:r>
-            <w:proofErr w:type="spellStart"/>
-            <w:r>
-              <w:t>Chirp</w:t>
-            </w:r>
-            <w:proofErr w:type="spellEnd"/>
+              <w:t>ADC-Samples pro Chirp</w:t>
+            </w:r>
           </w:p>
         </w:tc>
         <w:tc>
@@ -1626,13 +1561,8 @@
           </w:tcPr>
           <w:p>
             <w:r>
-              <w:t xml:space="preserve">10.000 </w:t>
-            </w:r>
-            <w:proofErr w:type="spellStart"/>
-            <w:r>
-              <w:t>ksps</w:t>
-            </w:r>
-            <w:proofErr w:type="spellEnd"/>
+              <w:t>10.000 ksps</w:t>
+            </w:r>
           </w:p>
         </w:tc>
       </w:tr>
@@ -1676,13 +1606,8 @@
             <w:hideMark/>
           </w:tcPr>
           <w:p>
-            <w:proofErr w:type="spellStart"/>
-            <w:r>
-              <w:t>Chirps</w:t>
-            </w:r>
-            <w:proofErr w:type="spellEnd"/>
-            <w:r>
-              <w:t xml:space="preserve"> pro Frame</w:t>
+            <w:r>
+              <w:t>Chirps pro Frame</w:t>
             </w:r>
           </w:p>
         </w:tc>
@@ -1752,13 +1677,8 @@
           </w:tcPr>
           <w:p>
             <w:r>
-              <w:t xml:space="preserve">50 </w:t>
-            </w:r>
-            <w:proofErr w:type="spellStart"/>
-            <w:r>
-              <w:t>ms</w:t>
-            </w:r>
-            <w:proofErr w:type="spellEnd"/>
+              <w:t>50 ms</w:t>
+            </w:r>
           </w:p>
         </w:tc>
       </w:tr>
@@ -1798,71 +1718,23 @@
       </w:r>
       <w:r>
         <w:br/>
-        <w:t xml:space="preserve">Erklären Sie, dass dieses Modul die Analysesoftware unabhängig von einem fest einprogrammierten Aufzeichnungsformat macht. </w:t>
-      </w:r>
-      <w:proofErr w:type="spellStart"/>
-      <w:r>
-        <w:t>mmWave</w:t>
-      </w:r>
-      <w:proofErr w:type="spellEnd"/>
-      <w:r>
-        <w:t xml:space="preserve"> Studio kann rohe ADC-Aufzeichnungen mit unterschiedlichen Sample-Zahlen, </w:t>
-      </w:r>
-      <w:proofErr w:type="spellStart"/>
-      <w:r>
-        <w:t>Chirps</w:t>
-      </w:r>
-      <w:proofErr w:type="spellEnd"/>
-      <w:r>
-        <w:t xml:space="preserve">, Frames, Empfangskanälen und Timing-Parametern erzeugen. Der Python-Code liest daher verfügbare Konfigurationsquellen ein, zum Beispiel die </w:t>
-      </w:r>
-      <w:proofErr w:type="spellStart"/>
-      <w:r>
-        <w:t>mmWave</w:t>
-      </w:r>
-      <w:proofErr w:type="spellEnd"/>
-      <w:r>
-        <w:t>-Studio-Konfiguration, API-Logs, Profile-CSV und Rohdaten-Logdateien, und nutzt diese Informationen, um die Daten korrekt zu rekonstruieren.</w:t>
-      </w:r>
-    </w:p>
-    <w:p>
-      <w:r>
-        <w:t xml:space="preserve">Die rohe Binärdatei selbst ist nur ein Strom von Zahlen. Sie sagt dem späteren Algorithmus nicht direkt, wo ein Frame endet, zu welchem Empfangskanal ein Sample gehört oder wie viele </w:t>
-      </w:r>
-      <w:proofErr w:type="spellStart"/>
-      <w:r>
-        <w:t>Chirps</w:t>
-      </w:r>
-      <w:proofErr w:type="spellEnd"/>
-      <w:r>
-        <w:t xml:space="preserve"> aufgezeichnet wurden. Das Rekonstruktionsmodul nutzt die eingelesene Konfiguration, um diesen Datenstrom in einen strukturierten Radar-Datenwürfel umzuwandeln.</w:t>
-      </w:r>
-    </w:p>
-    <w:p>
-      <w:r>
-        <w:t xml:space="preserve">In diesem Projekt wurde typischerweise mit 77 GHz Startfrequenz, 256 ADC-Samples pro </w:t>
-      </w:r>
-      <w:proofErr w:type="spellStart"/>
-      <w:r>
-        <w:t>Chirp</w:t>
-      </w:r>
-      <w:proofErr w:type="spellEnd"/>
-      <w:r>
-        <w:t xml:space="preserve">, 4 Empfangskanälen, 16-bit komplexen IQ-Daten, 2 LVDS-Lanes und 20 Hz Frame-Rate gearbeitet. Entscheidend ist, dass diese Werte nicht manuell im Verarbeitungscode angenommen werden. Sie werden aus der Aufzeichnungskonfiguration gelesen, sodass der Code unterschiedliche </w:t>
-      </w:r>
-      <w:proofErr w:type="spellStart"/>
-      <w:r>
-        <w:t>mmWave</w:t>
-      </w:r>
-      <w:proofErr w:type="spellEnd"/>
-      <w:r>
-        <w:t>-Studio-Ausgaben verarbeiten kann, solange sie ein unterstütztes Rohdatenformat verwenden.</w:t>
+        <w:t>Erklären Sie, dass dieses Modul die Analysesoftware unabhängig von einem fest einprogrammierten Aufzeichnungsformat macht. mmWave Studio kann rohe ADC-Aufzeichnungen mit unterschiedlichen Sample-Zahlen, Chirps, Frames, Empfangskanälen und Timing-Parametern erzeugen. Der Python-Code liest daher verfügbare Konfigurationsquellen ein, zum Beispiel die mmWave-Studio-Konfiguration, API-Logs, Profile-CSV und Rohdaten-Logdateien, und nutzt diese Informationen, um die Daten korrekt zu rekonstruieren.</w:t>
+      </w:r>
+    </w:p>
+    <w:p>
+      <w:r>
+        <w:t>Die rohe Binärdatei selbst ist nur ein Strom von Zahlen. Sie sagt dem späteren Algorithmus nicht direkt, wo ein Frame endet, zu welchem Empfangskanal ein Sample gehört oder wie viele Chirps aufgezeichnet wurden. Das Rekonstruktionsmodul nutzt die eingelesene Konfiguration, um diesen Datenstrom in einen strukturierten Radar-Datenwürfel umzuwandeln.</w:t>
+      </w:r>
+    </w:p>
+    <w:p>
+      <w:r>
+        <w:t>In diesem Projekt wurde typischerweise mit 77 GHz Startfrequenz, 256 ADC-Samples pro Chirp, 4 Empfangskanälen, 16-bit komplexen IQ-Daten, 2 LVDS-Lanes und 20 Hz Frame-Rate gearbeitet. Entscheidend ist, dass diese Werte nicht manuell im Verarbeitungscode angenommen werden. Sie werden aus der Aufzeichnungskonfiguration gelesen, sodass der Code unterschiedliche mmWave-Studio-Ausgaben verarbeiten kann, solange sie ein unterstütztes Rohdatenformat verwenden.</w:t>
       </w:r>
     </w:p>
     <w:p>
       <w:r>
         <w:pict w14:anchorId="0A38341D">
-          <v:rect id="_x0000_i1119" style="width:0;height:1.5pt" o:hralign="center" o:hrstd="t" o:hr="t" fillcolor="#a0a0a0" stroked="f"/>
+          <v:rect id="_x0000_i1029" style="width:0;height:1.5pt" o:hralign="center" o:hrstd="t" o:hr="t" fillcolor="#a0a0a0" stroked="f"/>
         </w:pict>
       </w:r>
     </w:p>
@@ -1873,11 +1745,36 @@
           <w:bCs/>
         </w:rPr>
       </w:pPr>
-      <w:r>
-        <w:rPr>
-          <w:b/>
-          <w:bCs/>
-        </w:rPr>
+    </w:p>
+    <w:p>
+      <w:pPr>
+        <w:rPr>
+          <w:b/>
+          <w:bCs/>
+        </w:rPr>
+      </w:pPr>
+    </w:p>
+    <w:p>
+      <w:pPr>
+        <w:rPr>
+          <w:b/>
+          <w:bCs/>
+        </w:rPr>
+      </w:pPr>
+    </w:p>
+    <w:p>
+      <w:pPr>
+        <w:rPr>
+          <w:b/>
+          <w:bCs/>
+        </w:rPr>
+      </w:pPr>
+      <w:r>
+        <w:rPr>
+          <w:b/>
+          <w:bCs/>
+        </w:rPr>
+        <w:lastRenderedPageBreak/>
         <w:t>6. Reflexionen nach Entfernung trennen</w:t>
       </w:r>
     </w:p>
@@ -1903,163 +1800,145 @@
         </w:numPr>
       </w:pPr>
       <w:r>
+        <w:t xml:space="preserve">Jeder gesendete Chirp durchläuft einen Frequenzbereich </w:t>
+      </w:r>
+    </w:p>
+    <w:p>
+      <w:pPr>
+        <w:numPr>
+          <w:ilvl w:val="0"/>
+          <w:numId w:val="5"/>
+        </w:numPr>
+      </w:pPr>
+      <w:r>
+        <w:t xml:space="preserve">Eine Reflexion von einem weiter entfernten Objekt kommt etwas später zurück als eine Reflexion von einem näheren Objekt </w:t>
+      </w:r>
+    </w:p>
+    <w:p>
+      <w:pPr>
+        <w:numPr>
+          <w:ilvl w:val="0"/>
+          <w:numId w:val="5"/>
+        </w:numPr>
+      </w:pPr>
+      <w:r>
+        <w:t xml:space="preserve">Nach dem Mischen von Sende- und Empfangssignal erscheint diese Zeitverzögerung als charakteristische Beat-Frequenz </w:t>
+      </w:r>
+    </w:p>
+    <w:p>
+      <w:pPr>
+        <w:numPr>
+          <w:ilvl w:val="0"/>
+          <w:numId w:val="5"/>
+        </w:numPr>
+      </w:pPr>
+      <w:r>
+        <w:t xml:space="preserve">Eine Fourier-Transformation trennt diese Beat-Frequenzen </w:t>
+      </w:r>
+    </w:p>
+    <w:p>
+      <w:pPr>
+        <w:numPr>
+          <w:ilvl w:val="0"/>
+          <w:numId w:val="5"/>
+        </w:numPr>
+      </w:pPr>
+      <w:r>
+        <w:t xml:space="preserve">Jede Frequenzkomponente entspricht einem Entfernungsbereich </w:t>
+      </w:r>
+    </w:p>
+    <w:p>
+      <w:pPr>
+        <w:numPr>
+          <w:ilvl w:val="0"/>
+          <w:numId w:val="5"/>
+        </w:numPr>
+      </w:pPr>
+      <w:r>
+        <w:t xml:space="preserve">Starke Entfernungsbereiche deuten auf Objekte oder Körperregionen in der Szene hin </w:t>
+      </w:r>
+    </w:p>
+    <w:p>
+      <w:r>
+        <w:t>Sprechernotizen:</w:t>
+      </w:r>
+      <w:r>
+        <w:br/>
+        <w:t>Erklären Sie diesen Schritt etwas anschaulicher, weil die Nutzung einer Fourier-Transformation für Entfernung nicht sofort intuitiv ist. Das Radar sendet einen Chirp, das heißt die gesendete Frequenz steigt über die Zeit an. Ein reflektiertes Signal von einem Objekt kommt mit einer kleinen Verzögerung zurück. Je weiter das Objekt entfernt ist, desto größer ist diese Verzögerung.</w:t>
+      </w:r>
+    </w:p>
+    <w:p>
+      <w:r>
+        <w:t>Da sich die gesendete Frequenz während des Chirps kontinuierlich ändert, hat die verzögerte Reflexion eine leicht andere Frequenz als das Signal, das zu diesem Zeitpunkt gerade gesendet wird. Die Radarelektronik mischt Sende- und Empfangssignal. Daraus entsteht ein niederfrequenteres Signal, das Beat-Signal. Der zentrale Punkt ist: Die Beat-Frequenz hängt von der Verzögerung ab, und die Verzögerung hängt von der Objektentfernung ab.</w:t>
+      </w:r>
+    </w:p>
+    <w:p>
+      <w:r>
+        <w:t>Die Fourier-Transformation wird dann über die ADC-Samples eines Chirps angewendet. Sie trennt die unterschiedlichen Beat-Frequenzanteile im Empfangssignal. Da jede Beat-Frequenz einer anderen Entfernung entspricht, entsteht ein Entfernungsprofil. In diesem Profil zeigen starke Peaks, bei welchen Distanzen starke Reflexionen vorhanden sind. So wird aus der abgetasteten Chirp-Antwort Entfernungsinformation.</w:t>
+      </w:r>
+    </w:p>
+    <w:p>
+      <w:r>
+        <w:t>Für die Vitalzeichenmessung misst dieser Schritt noch keine Atmung oder Herzfrequenz. Er dient dazu, Bereiche mit nützlichen Reflexionen zu finden, damit die spätere phasenbasierte Verarbeitung auf den Bereich fokussieren kann, der am wahrscheinlichsten die Brustbewegung der Person enthält.</w:t>
+      </w:r>
+    </w:p>
+    <w:p>
+      <w:r>
+        <w:pict w14:anchorId="2933F33C">
+          <v:rect id="_x0000_i1030" style="width:0;height:1.5pt" o:hralign="center" o:hrstd="t" o:hr="t" fillcolor="#a0a0a0" stroked="f"/>
+        </w:pict>
+      </w:r>
+    </w:p>
+    <w:p>
+      <w:pPr>
+        <w:rPr>
+          <w:b/>
+          <w:bCs/>
+        </w:rPr>
+      </w:pPr>
+      <w:r>
+        <w:rPr>
+          <w:b/>
+          <w:bCs/>
+        </w:rPr>
+        <w:t>7. Die Reflexion mit Brustbewegung finden</w:t>
+      </w:r>
+    </w:p>
+    <w:p>
+      <w:r>
+        <w:rPr>
+          <w:b/>
+          <w:bCs/>
+        </w:rPr>
+        <w:t>Objekt- / Personenerkennung</w:t>
+      </w:r>
+    </w:p>
+    <w:p>
+      <w:r>
+        <w:t>Stichpunkte:</w:t>
+      </w:r>
+    </w:p>
+    <w:p>
+      <w:pPr>
+        <w:numPr>
+          <w:ilvl w:val="0"/>
+          <w:numId w:val="6"/>
+        </w:numPr>
+      </w:pPr>
+      <w:r>
+        <w:t xml:space="preserve">Das Radar empfängt Reflexionen von Personen und statischen Objekten </w:t>
+      </w:r>
+    </w:p>
+    <w:p>
+      <w:pPr>
+        <w:numPr>
+          <w:ilvl w:val="0"/>
+          <w:numId w:val="6"/>
+        </w:numPr>
+      </w:pPr>
+      <w:r>
         <w:lastRenderedPageBreak/>
-        <w:t xml:space="preserve">Jeder gesendete </w:t>
-      </w:r>
-      <w:proofErr w:type="spellStart"/>
-      <w:r>
-        <w:t>Chirp</w:t>
-      </w:r>
-      <w:proofErr w:type="spellEnd"/>
-      <w:r>
-        <w:t xml:space="preserve"> durchläuft einen Frequenzbereich </w:t>
-      </w:r>
-    </w:p>
-    <w:p>
-      <w:pPr>
-        <w:numPr>
-          <w:ilvl w:val="0"/>
-          <w:numId w:val="5"/>
-        </w:numPr>
-      </w:pPr>
-      <w:r>
-        <w:t xml:space="preserve">Eine Reflexion von einem weiter entfernten Objekt kommt etwas später zurück als eine Reflexion von einem näheren Objekt </w:t>
-      </w:r>
-    </w:p>
-    <w:p>
-      <w:pPr>
-        <w:numPr>
-          <w:ilvl w:val="0"/>
-          <w:numId w:val="5"/>
-        </w:numPr>
-      </w:pPr>
-      <w:r>
-        <w:t xml:space="preserve">Nach dem Mischen von Sende- und Empfangssignal erscheint diese Zeitverzögerung als charakteristische Beat-Frequenz </w:t>
-      </w:r>
-    </w:p>
-    <w:p>
-      <w:pPr>
-        <w:numPr>
-          <w:ilvl w:val="0"/>
-          <w:numId w:val="5"/>
-        </w:numPr>
-      </w:pPr>
-      <w:r>
-        <w:t xml:space="preserve">Eine Fourier-Transformation trennt diese Beat-Frequenzen </w:t>
-      </w:r>
-    </w:p>
-    <w:p>
-      <w:pPr>
-        <w:numPr>
-          <w:ilvl w:val="0"/>
-          <w:numId w:val="5"/>
-        </w:numPr>
-      </w:pPr>
-      <w:r>
-        <w:t xml:space="preserve">Jede Frequenzkomponente entspricht einem Entfernungsbereich </w:t>
-      </w:r>
-    </w:p>
-    <w:p>
-      <w:pPr>
-        <w:numPr>
-          <w:ilvl w:val="0"/>
-          <w:numId w:val="5"/>
-        </w:numPr>
-      </w:pPr>
-      <w:r>
-        <w:t xml:space="preserve">Starke Entfernungsbereiche deuten auf Objekte oder Körperregionen in der Szene hin </w:t>
-      </w:r>
-    </w:p>
-    <w:p>
-      <w:r>
-        <w:t>Sprechernotizen:</w:t>
-      </w:r>
-      <w:r>
-        <w:br/>
-        <w:t xml:space="preserve">Erklären Sie diesen Schritt etwas anschaulicher, weil die Nutzung einer Fourier-Transformation für Entfernung nicht sofort intuitiv ist. Das Radar sendet einen </w:t>
-      </w:r>
-      <w:proofErr w:type="spellStart"/>
-      <w:r>
-        <w:t>Chirp</w:t>
-      </w:r>
-      <w:proofErr w:type="spellEnd"/>
-      <w:r>
-        <w:t>, das heißt die gesendete Frequenz steigt über die Zeit an. Ein reflektiertes Signal von einem Objekt kommt mit einer kleinen Verzögerung zurück. Je weiter das Objekt entfernt ist, desto größer ist diese Verzögerung.</w:t>
-      </w:r>
-    </w:p>
-    <w:p>
-      <w:r>
-        <w:t xml:space="preserve">Da sich die gesendete Frequenz während des </w:t>
-      </w:r>
-      <w:proofErr w:type="spellStart"/>
-      <w:r>
-        <w:t>Chirps</w:t>
-      </w:r>
-      <w:proofErr w:type="spellEnd"/>
-      <w:r>
-        <w:t xml:space="preserve"> kontinuierlich ändert, hat die verzögerte Reflexion eine leicht andere Frequenz als das Signal, das zu diesem Zeitpunkt gerade gesendet wird. Die Radarelektronik mischt Sende- und Empfangssignal. Daraus entsteht ein niederfrequenteres Signal, das Beat-Signal. Der zentrale Punkt ist: Die Beat-Frequenz hängt von der Verzögerung ab, und die Verzögerung hängt von der Objektentfernung ab.</w:t>
-      </w:r>
-    </w:p>
-    <w:p>
-      <w:r>
-        <w:t xml:space="preserve">Die Fourier-Transformation wird dann über die ADC-Samples eines </w:t>
-      </w:r>
-      <w:proofErr w:type="spellStart"/>
-      <w:r>
-        <w:t>Chirps</w:t>
-      </w:r>
-      <w:proofErr w:type="spellEnd"/>
-      <w:r>
-        <w:t xml:space="preserve"> angewendet. Sie trennt die unterschiedlichen Beat-Frequenzanteile im Empfangssignal. Da jede Beat-Frequenz einer anderen Entfernung entspricht, entsteht ein Entfernungsprofil. In diesem Profil zeigen starke Peaks, bei welchen Distanzen starke Reflexionen vorhanden sind. So wird aus der abgetasteten </w:t>
-      </w:r>
-      <w:proofErr w:type="spellStart"/>
-      <w:r>
-        <w:t>Chirp</w:t>
-      </w:r>
-      <w:proofErr w:type="spellEnd"/>
-      <w:r>
-        <w:t>-Antwort Entfernungsinformation.</w:t>
-      </w:r>
-    </w:p>
-    <w:p>
-      <w:r>
-        <w:t>Für die Vitalzeichenmessung misst dieser Schritt noch keine Atmung oder Herzfrequenz. Er dient dazu, Bereiche mit nützlichen Reflexionen zu finden, damit die spätere phasenbasierte Verarbeitung auf den Bereich fokussieren kann, der am wahrscheinlichsten die Brustbewegung der Person enthält.</w:t>
-      </w:r>
-    </w:p>
-    <w:p>
-      <w:r>
-        <w:pict w14:anchorId="2933F33C">
-          <v:rect id="_x0000_i1120" style="width:0;height:1.5pt" o:hralign="center" o:hrstd="t" o:hr="t" fillcolor="#a0a0a0" stroked="f"/>
-        </w:pict>
-      </w:r>
-    </w:p>
-    <w:p>
-      <w:pPr>
-        <w:rPr>
-          <w:b/>
-          <w:bCs/>
-        </w:rPr>
-      </w:pPr>
-      <w:r>
-        <w:rPr>
-          <w:b/>
-          <w:bCs/>
-        </w:rPr>
-        <w:t>7. Die Reflexion mit Brustbewegung finden</w:t>
-      </w:r>
-    </w:p>
-    <w:p>
-      <w:r>
-        <w:rPr>
-          <w:b/>
-          <w:bCs/>
-        </w:rPr>
-        <w:t>Objekt- / Personenerkennung</w:t>
-      </w:r>
-    </w:p>
-    <w:p>
-      <w:r>
-        <w:t>Stichpunkte:</w:t>
+        <w:t xml:space="preserve">Statische Objekte sind oft starke Reflektoren, zeigen aber keine physiologische Bewegung </w:t>
       </w:r>
     </w:p>
     <w:p>
@@ -2070,7 +1949,7 @@
         </w:numPr>
       </w:pPr>
       <w:r>
-        <w:t xml:space="preserve">Das Radar empfängt Reflexionen von Personen und statischen Objekten </w:t>
+        <w:t xml:space="preserve">Der Algorithmus sucht nach Bereichen mit ausreichender Reflexionsstärke und nutzbarer Phasenstabilität </w:t>
       </w:r>
     </w:p>
     <w:p>
@@ -2081,7 +1960,7 @@
         </w:numPr>
       </w:pPr>
       <w:r>
-        <w:t xml:space="preserve">Statische Objekte sind oft starke Reflektoren, zeigen aber keine physiologische Bewegung </w:t>
+        <w:t xml:space="preserve">Kandidatenbereiche werden auf Bewegungsanteile in plausiblen Atem- und Herzfrequenzbändern geprüft </w:t>
       </w:r>
     </w:p>
     <w:p>
@@ -2092,38 +1971,7 @@
         </w:numPr>
       </w:pPr>
       <w:r>
-        <w:t xml:space="preserve">Der Algorithmus sucht nach Bereichen mit ausreichender Reflexionsstärke und nutzbarer Phasenstabilität </w:t>
-      </w:r>
-    </w:p>
-    <w:p>
-      <w:pPr>
-        <w:numPr>
-          <w:ilvl w:val="0"/>
-          <w:numId w:val="6"/>
-        </w:numPr>
-      </w:pPr>
-      <w:r>
-        <w:lastRenderedPageBreak/>
-        <w:t xml:space="preserve">Kandidatenbereiche werden auf Bewegungsanteile in plausiblen Atem- und Herzfrequenzbändern geprüft </w:t>
-      </w:r>
-    </w:p>
-    <w:p>
-      <w:pPr>
-        <w:numPr>
-          <w:ilvl w:val="0"/>
-          <w:numId w:val="6"/>
-        </w:numPr>
-      </w:pPr>
-      <w:r>
-        <w:t xml:space="preserve">Die ausgewählte Region </w:t>
-      </w:r>
-      <w:proofErr w:type="spellStart"/>
-      <w:r>
-        <w:t>of</w:t>
-      </w:r>
-      <w:proofErr w:type="spellEnd"/>
-      <w:r>
-        <w:t xml:space="preserve"> Interest sollte periodische Brustbewegung enthalten, nicht nur hohe Reflexionsleistung </w:t>
+        <w:t xml:space="preserve">Die ausgewählte Region of Interest sollte periodische Brustbewegung enthalten, nicht nur hohe Reflexionsleistung </w:t>
       </w:r>
     </w:p>
     <w:p>
@@ -2388,7 +2236,6 @@
             <w:hideMark/>
           </w:tcPr>
           <w:p>
-            <w:proofErr w:type="spellStart"/>
             <w:r>
               <w:rPr>
                 <w:b/>
@@ -2396,7 +2243,6 @@
               </w:rPr>
               <w:t>Artefaktunterdrückung</w:t>
             </w:r>
-            <w:proofErr w:type="spellEnd"/>
           </w:p>
         </w:tc>
         <w:tc>
@@ -2429,21 +2275,13 @@
     </w:p>
     <w:p>
       <w:r>
-        <w:t xml:space="preserve">Der Erkennungsschritt wählt daher eine Region </w:t>
-      </w:r>
-      <w:proofErr w:type="spellStart"/>
-      <w:r>
-        <w:t>of</w:t>
-      </w:r>
-      <w:proofErr w:type="spellEnd"/>
-      <w:r>
-        <w:t xml:space="preserve"> Interest anhand mehrerer Kriterien aus: Die Reflexion muss stark genug sein, in einer plausiblen Messdistanz liegen, über die Zeit stabil bleiben und für Phasenextraktion geeignet sein. Nach der Auswahl eines Kandidaten prüfen die späteren Verarbeitungsschritte, ob die extrahierte Bewegung plausible Atem- und Herzfrequenzanteile enthält. Deshalb ist die Personenerkennung kritisch: Wenn die falsche Reflexion ausgewählt wird, kann die restliche Pipeline trotzdem eine Zahl ausgeben, die aber nicht die tatsächliche Person beschreibt.</w:t>
+        <w:t>Der Erkennungsschritt wählt daher eine Region of Interest anhand mehrerer Kriterien aus: Die Reflexion muss stark genug sein, in einer plausiblen Messdistanz liegen, über die Zeit stabil bleiben und für Phasenextraktion geeignet sein. Nach der Auswahl eines Kandidaten prüfen die späteren Verarbeitungsschritte, ob die extrahierte Bewegung plausible Atem- und Herzfrequenzanteile enthält. Deshalb ist die Personenerkennung kritisch: Wenn die falsche Reflexion ausgewählt wird, kann die restliche Pipeline trotzdem eine Zahl ausgeben, die aber nicht die tatsächliche Person beschreibt.</w:t>
       </w:r>
     </w:p>
     <w:p>
       <w:r>
         <w:pict w14:anchorId="49070F33">
-          <v:rect id="_x0000_i1121" style="width:0;height:1.5pt" o:hralign="center" o:hrstd="t" o:hr="t" fillcolor="#a0a0a0" stroked="f"/>
+          <v:rect id="_x0000_i1031" style="width:0;height:1.5pt" o:hralign="center" o:hrstd="t" o:hr="t" fillcolor="#a0a0a0" stroked="f"/>
         </w:pict>
       </w:r>
     </w:p>
@@ -2459,7 +2297,15 @@
           <w:b/>
           <w:bCs/>
         </w:rPr>
-        <w:t>8. Radarphase in ein Bewegungssignal umwandeln</w:t>
+        <w:lastRenderedPageBreak/>
+        <w:t xml:space="preserve">8. </w:t>
+      </w:r>
+      <w:r>
+        <w:rPr>
+          <w:b/>
+          <w:bCs/>
+        </w:rPr>
+        <w:t>Phase Wrapping und Unwrapping</w:t>
       </w:r>
     </w:p>
     <w:p>
@@ -2473,7 +2319,6 @@
     </w:p>
     <w:p>
       <w:r>
-        <w:lastRenderedPageBreak/>
         <w:t>Stichpunkte:</w:t>
       </w:r>
     </w:p>
@@ -2529,15 +2374,7 @@
         </w:numPr>
       </w:pPr>
       <w:r>
-        <w:t>Phasen-</w:t>
-      </w:r>
-      <w:proofErr w:type="spellStart"/>
-      <w:r>
-        <w:t>Wrapping</w:t>
-      </w:r>
-      <w:proofErr w:type="spellEnd"/>
-      <w:r>
-        <w:t xml:space="preserve"> entsteht, wenn die Phase die Kreisgrenze überschreitet und von +π auf −π springt, oder umgekehrt </w:t>
+        <w:t xml:space="preserve">Phasen-Wrapping entsteht, wenn die Phase die Kreisgrenze überschreitet und von +π auf −π springt, oder umgekehrt </w:t>
       </w:r>
     </w:p>
     <w:p>
@@ -2548,15 +2385,7 @@
         </w:numPr>
       </w:pPr>
       <w:r>
-        <w:t>Phasen-</w:t>
-      </w:r>
-      <w:proofErr w:type="spellStart"/>
-      <w:r>
-        <w:t>Unwrapping</w:t>
-      </w:r>
-      <w:proofErr w:type="spellEnd"/>
-      <w:r>
-        <w:t xml:space="preserve"> entfernt diese künstlichen Sprünge </w:t>
+        <w:t xml:space="preserve">Phasen-Unwrapping entfernt diese künstlichen Sprünge </w:t>
       </w:r>
     </w:p>
     <w:p>
@@ -2581,34 +2410,18 @@
     </w:p>
     <w:p>
       <w:r>
-        <w:t>Die Phase wird jedoch normalerweise nur in einem begrenzten Bereich gemessen, zum Beispiel von −π bis +π. Wenn die tatsächliche Phase über diese Grenze hinaus weiterläuft, springt der gemessene Wert plötzlich von +π auf −π, obwohl die physikalische Brustbewegung kontinuierlich war. Das nennt man Phasen-</w:t>
-      </w:r>
-      <w:proofErr w:type="spellStart"/>
-      <w:r>
-        <w:t>Wrapping</w:t>
-      </w:r>
-      <w:proofErr w:type="spellEnd"/>
-      <w:r>
-        <w:t>.</w:t>
-      </w:r>
-    </w:p>
-    <w:p>
-      <w:r>
-        <w:t>Phasen-</w:t>
-      </w:r>
-      <w:proofErr w:type="spellStart"/>
-      <w:r>
-        <w:t>Unwrapping</w:t>
-      </w:r>
-      <w:proofErr w:type="spellEnd"/>
-      <w:r>
-        <w:t xml:space="preserve"> korrigiert diese künstlichen Sprünge und rekonstruiert eine kontinuierliche Phasenkurve. Das Ergebnis ist noch keine direkte medizinische Messgröße, verhält sich aber wie ein kleines Verschiebungssignal, das Atem- und Herzbewegungen enthält. Dieses kontinuierliche Bewegungssignal wird anschließend für Filterung und Frequenzschätzung verwendet.</w:t>
+        <w:t>Die Phase wird jedoch normalerweise nur in einem begrenzten Bereich gemessen, zum Beispiel von −π bis +π. Wenn die tatsächliche Phase über diese Grenze hinaus weiterläuft, springt der gemessene Wert plötzlich von +π auf −π, obwohl die physikalische Brustbewegung kontinuierlich war. Das nennt man Phasen-Wrapping.</w:t>
+      </w:r>
+    </w:p>
+    <w:p>
+      <w:r>
+        <w:t>Phasen-Unwrapping korrigiert diese künstlichen Sprünge und rekonstruiert eine kontinuierliche Phasenkurve. Das Ergebnis ist noch keine direkte medizinische Messgröße, verhält sich aber wie ein kleines Verschiebungssignal, das Atem- und Herzbewegungen enthält. Dieses kontinuierliche Bewegungssignal wird anschließend für Filterung und Frequenzschätzung verwendet.</w:t>
       </w:r>
     </w:p>
     <w:p>
       <w:r>
         <w:pict w14:anchorId="2EDEFF87">
-          <v:rect id="_x0000_i1122" style="width:0;height:1.5pt" o:hralign="center" o:hrstd="t" o:hr="t" fillcolor="#a0a0a0" stroked="f"/>
+          <v:rect id="_x0000_i1032" style="width:0;height:1.5pt" o:hralign="center" o:hrstd="t" o:hr="t" fillcolor="#a0a0a0" stroked="f"/>
         </w:pict>
       </w:r>
     </w:p>
@@ -2660,15 +2473,7 @@
         </w:numPr>
       </w:pPr>
       <w:r>
-        <w:t>Langsame Basisliniendrift wird mit einem Moving-Average-</w:t>
-      </w:r>
-      <w:proofErr w:type="spellStart"/>
-      <w:r>
-        <w:t>Detrending</w:t>
-      </w:r>
-      <w:proofErr w:type="spellEnd"/>
-      <w:r>
-        <w:t xml:space="preserve"> reduziert </w:t>
+        <w:t xml:space="preserve">Langsame Basisliniendrift wird mit einem Moving-Average-Detrending reduziert </w:t>
       </w:r>
     </w:p>
     <w:p>
@@ -2679,6 +2484,7 @@
         </w:numPr>
       </w:pPr>
       <w:r>
+        <w:lastRenderedPageBreak/>
         <w:t xml:space="preserve">Atem-Bandpassfilter: </w:t>
       </w:r>
       <w:r>
@@ -2741,7 +2547,6 @@
         </w:numPr>
       </w:pPr>
       <w:r>
-        <w:lastRenderedPageBreak/>
         <w:t xml:space="preserve">Beide Signale werden mit einem </w:t>
       </w:r>
       <w:r>
@@ -2788,15 +2593,7 @@
     </w:p>
     <w:p>
       <w:r>
-        <w:t xml:space="preserve">Der erste Schritt ist das </w:t>
-      </w:r>
-      <w:proofErr w:type="spellStart"/>
-      <w:r>
-        <w:t>Detrending</w:t>
-      </w:r>
-      <w:proofErr w:type="spellEnd"/>
-      <w:r>
-        <w:t>. Ein gleitender Mittelwert wird genutzt, um langsame Basisliniendrift abzuschätzen, und diese Drift wird vom Bewegungssignal abgezogen. Dadurch werden sehr langsame Änderungen unterdrückt, die nicht mit Atmung oder Herzschlag zusammenhängen.</w:t>
+        <w:t>Der erste Schritt ist das Detrending. Ein gleitender Mittelwert wird genutzt, um langsame Basisliniendrift abzuschätzen, und diese Drift wird vom Bewegungssignal abgezogen. Dadurch werden sehr langsame Änderungen unterdrückt, die nicht mit Atmung oder Herzschlag zusammenhängen.</w:t>
       </w:r>
     </w:p>
     <w:p>
@@ -2812,7 +2609,7 @@
     <w:p>
       <w:r>
         <w:pict w14:anchorId="3BFDBC61">
-          <v:rect id="_x0000_i1123" style="width:0;height:1.5pt" o:hralign="center" o:hrstd="t" o:hr="t" fillcolor="#a0a0a0" stroked="f"/>
+          <v:rect id="_x0000_i1033" style="width:0;height:1.5pt" o:hralign="center" o:hrstd="t" o:hr="t" fillcolor="#a0a0a0" stroked="f"/>
         </w:pict>
       </w:r>
     </w:p>
@@ -2875,15 +2672,7 @@
         </w:numPr>
       </w:pPr>
       <w:r>
-        <w:t xml:space="preserve">Die Atemfrequenz wird aus dem stärksten plausiblen Peak im </w:t>
-      </w:r>
-      <w:proofErr w:type="spellStart"/>
-      <w:r>
-        <w:t>Atemband</w:t>
-      </w:r>
-      <w:proofErr w:type="spellEnd"/>
-      <w:r>
-        <w:t xml:space="preserve"> ausgewählt </w:t>
+        <w:t xml:space="preserve">Die Atemfrequenz wird aus dem stärksten plausiblen Peak im Atemband ausgewählt </w:t>
       </w:r>
     </w:p>
     <w:p>
@@ -2916,6 +2705,7 @@
         </w:numPr>
       </w:pPr>
       <w:r>
+        <w:lastRenderedPageBreak/>
         <w:t xml:space="preserve">Kandidatenpeaks werden anhand von Signalstärke, physiologischer Plausibilität und Abstand zu Harmonischen bewertet </w:t>
       </w:r>
     </w:p>
@@ -2958,7 +2748,6 @@
         </w:numPr>
       </w:pPr>
       <w:r>
-        <w:lastRenderedPageBreak/>
         <w:t xml:space="preserve">Angezeigte Verläufe werden mit Medianfilterung, Sprungbegrenzung und exponentieller Glättung stabilisiert </w:t>
       </w:r>
     </w:p>
@@ -2978,28 +2767,12 @@
     </w:p>
     <w:p>
       <w:r>
-        <w:t xml:space="preserve">Für die Atmung ist die Entscheidung meist direkter. Der Algorithmus sucht nach dem stärksten plausiblen Frequenzpeak im </w:t>
-      </w:r>
-      <w:proofErr w:type="spellStart"/>
-      <w:r>
-        <w:t>Atemband</w:t>
-      </w:r>
-      <w:proofErr w:type="spellEnd"/>
-      <w:r>
-        <w:t xml:space="preserve"> und rechnet ihn in Atemzüge pro Minute um. Das ist im Allgemeinen zuverlässiger, weil Atmung eine deutlich stärkere Bewegung erzeugt als der Herzschlag.</w:t>
-      </w:r>
-    </w:p>
-    <w:p>
-      <w:r>
-        <w:t xml:space="preserve">Die Herzfrequenzschätzung benötigt zusätzliche Logik. Der stärkste Peak im </w:t>
-      </w:r>
-      <w:proofErr w:type="spellStart"/>
-      <w:r>
-        <w:t>Herzband</w:t>
-      </w:r>
-      <w:proofErr w:type="spellEnd"/>
-      <w:r>
-        <w:t xml:space="preserve"> ist nicht immer der echte Herzschlag. Atmung kann Harmonische erzeugen, also Vielfache der Atemfrequenz. Die 2. oder 3. Harmonische der Atmung kann in das Herzfrequenzband fallen und wie ein gültiger Herzschlagpeak aussehen.</w:t>
+        <w:t>Für die Atmung ist die Entscheidung meist direkter. Der Algorithmus sucht nach dem stärksten plausiblen Frequenzpeak im Atemband und rechnet ihn in Atemzüge pro Minute um. Das ist im Allgemeinen zuverlässiger, weil Atmung eine deutlich stärkere Bewegung erzeugt als der Herzschlag.</w:t>
+      </w:r>
+    </w:p>
+    <w:p>
+      <w:r>
+        <w:t>Die Herzfrequenzschätzung benötigt zusätzliche Logik. Der stärkste Peak im Herzband ist nicht immer der echte Herzschlag. Atmung kann Harmonische erzeugen, also Vielfache der Atemfrequenz. Die 2. oder 3. Harmonische der Atmung kann in das Herzfrequenzband fallen und wie ein gültiger Herzschlagpeak aussehen.</w:t>
       </w:r>
     </w:p>
     <w:p>
@@ -3015,7 +2788,7 @@
     <w:p>
       <w:r>
         <w:pict w14:anchorId="1030A304">
-          <v:rect id="_x0000_i1124" style="width:0;height:1.5pt" o:hralign="center" o:hrstd="t" o:hr="t" fillcolor="#a0a0a0" stroked="f"/>
+          <v:rect id="_x0000_i1034" style="width:0;height:1.5pt" o:hralign="center" o:hrstd="t" o:hr="t" fillcolor="#a0a0a0" stroked="f"/>
         </w:pict>
       </w:r>
     </w:p>
@@ -3078,6 +2851,7 @@
         </w:numPr>
       </w:pPr>
       <w:r>
+        <w:lastRenderedPageBreak/>
         <w:t xml:space="preserve">Die Genauigkeit wurde über die vollständige Messdauer bewertet </w:t>
       </w:r>
     </w:p>
@@ -3100,7 +2874,6 @@
         </w:numPr>
       </w:pPr>
       <w:r>
-        <w:lastRenderedPageBreak/>
         <w:t xml:space="preserve">Die Herzfrequenzgenauigkeit wurde stärker durch Bewegungsartefakte und schwache Signalamplitude beeinflusst </w:t>
       </w:r>
     </w:p>
@@ -3349,7 +3122,7 @@
     <w:p>
       <w:r>
         <w:pict w14:anchorId="34EA98C3">
-          <v:rect id="_x0000_i1125" style="width:0;height:1.5pt" o:hralign="center" o:hrstd="t" o:hr="t" fillcolor="#a0a0a0" stroked="f"/>
+          <v:rect id="_x0000_i1035" style="width:0;height:1.5pt" o:hralign="center" o:hrstd="t" o:hr="t" fillcolor="#a0a0a0" stroked="f"/>
         </w:pict>
       </w:r>
     </w:p>
@@ -3434,30 +3207,192 @@
         </w:numPr>
       </w:pPr>
       <w:r>
-        <w:t xml:space="preserve">Zukünftige Arbeit: stärkere Referenzvalidierung, verbessertes Personentracking und bessere </w:t>
-      </w:r>
-      <w:proofErr w:type="spellStart"/>
-      <w:r>
-        <w:t>Artefaktunterdrückung</w:t>
-      </w:r>
-      <w:proofErr w:type="spellEnd"/>
+        <w:t xml:space="preserve">Zukünftige Arbeit: stärkere Referenzvalidierung, verbessertes Personentracking und bessere Artefaktunterdrückung </w:t>
+      </w:r>
+    </w:p>
+    <w:p>
+      <w:r>
+        <w:t>Sprechernotizen:</w:t>
+      </w:r>
+      <w:r>
+        <w:br/>
+        <w:t xml:space="preserve">Schließen Sie den Vortrag ab, indem Sie die gesamte Pipeline zusammenfassen. Das Projekt zeigt, wie rohe Radardaten zu kontaktlosen Vitalzeichen-Schätzungen verarbeitet werden können. Erwähnen Sie, dass das Dashboard lediglich die finale Darstellung des verarbeiteten Ergebnisses ist. Beenden Sie die Präsentation nicht nur mit einer Danke-Folie. Nutzen Sie diese Folie stattdessen, um den Hauptbeitrag </w:t>
+      </w:r>
+      <w:r>
+        <w:lastRenderedPageBreak/>
+        <w:t>noch einmal klar zu formulieren: eine vollständige Python-Verarbeitungskette von Radar-Rohdaten zu Atemfrequenz- und Herzfrequenz-Schätzungen.</w:t>
+      </w:r>
+    </w:p>
+    <w:p>
+      <w:r>
+        <w:pict w14:anchorId="26F32F2F">
+          <v:rect id="_x0000_i1036" style="width:0;height:1.5pt" o:hralign="center" o:hrstd="t" o:hr="t" fillcolor="#a0a0a0" stroked="f"/>
+        </w:pict>
+      </w:r>
+    </w:p>
+    <w:p>
+      <w:pPr>
+        <w:rPr>
+          <w:b/>
+          <w:bCs/>
+        </w:rPr>
+      </w:pPr>
+      <w:r>
+        <w:rPr>
+          <w:b/>
+          <w:bCs/>
+        </w:rPr>
+        <w:t>Backup</w:t>
+      </w:r>
+    </w:p>
+    <w:p>
+      <w:r>
+        <w:t>Diese Folien gehören nicht zur 12-Folien-Hauptpräsentation. Sie dienen nur zur Beantwortung möglicher Fragen nach dem Vortrag.</w:t>
+      </w:r>
+    </w:p>
+    <w:p>
+      <w:pPr>
+        <w:rPr>
+          <w:b/>
+          <w:bCs/>
+        </w:rPr>
+      </w:pPr>
+      <w:r>
+        <w:rPr>
+          <w:b/>
+          <w:bCs/>
+        </w:rPr>
+        <w:t>Backup 1. Radarkonfiguration und Datenerfassung</w:t>
+      </w:r>
+    </w:p>
+    <w:p>
+      <w:r>
+        <w:rPr>
+          <w:b/>
+          <w:bCs/>
+        </w:rPr>
+        <w:t>Wie die Messdaten aufgezeichnet wurden</w:t>
+      </w:r>
+    </w:p>
+    <w:p>
+      <w:r>
+        <w:t>Stichpunkte:</w:t>
+      </w:r>
+    </w:p>
+    <w:p>
+      <w:pPr>
+        <w:numPr>
+          <w:ilvl w:val="0"/>
+          <w:numId w:val="12"/>
+        </w:numPr>
+      </w:pPr>
+      <w:r>
+        <w:t xml:space="preserve">Radardaten wurden mit </w:t>
+      </w:r>
+      <w:r>
+        <w:rPr>
+          <w:b/>
+          <w:bCs/>
+        </w:rPr>
+        <w:t>TI mmWave Studio</w:t>
+      </w:r>
+      <w:r>
+        <w:t xml:space="preserve"> aufgezeichnet </w:t>
+      </w:r>
+    </w:p>
+    <w:p>
+      <w:pPr>
+        <w:numPr>
+          <w:ilvl w:val="0"/>
+          <w:numId w:val="12"/>
+        </w:numPr>
+      </w:pPr>
+      <w:r>
+        <w:t xml:space="preserve">Verwendeter Radar-IC im Projekt: </w:t>
+      </w:r>
+      <w:r>
+        <w:rPr>
+          <w:b/>
+          <w:bCs/>
+        </w:rPr>
+        <w:t>TI IWR1843</w:t>
+      </w:r>
       <w:r>
         <w:t xml:space="preserve"> </w:t>
       </w:r>
     </w:p>
     <w:p>
+      <w:pPr>
+        <w:numPr>
+          <w:ilvl w:val="0"/>
+          <w:numId w:val="12"/>
+        </w:numPr>
+      </w:pPr>
+      <w:r>
+        <w:t xml:space="preserve">Verwendete Datenerfassungsplatine: </w:t>
+      </w:r>
+      <w:r>
+        <w:rPr>
+          <w:b/>
+          <w:bCs/>
+        </w:rPr>
+        <w:t>DCA1000EVM</w:t>
+      </w:r>
+      <w:r>
+        <w:t xml:space="preserve"> </w:t>
+      </w:r>
+    </w:p>
+    <w:p>
+      <w:pPr>
+        <w:numPr>
+          <w:ilvl w:val="0"/>
+          <w:numId w:val="12"/>
+        </w:numPr>
+      </w:pPr>
+      <w:r>
+        <w:t xml:space="preserve">Rohe ADC-Daten wurden für Offline-Verarbeitung gespeichert </w:t>
+      </w:r>
+    </w:p>
+    <w:p>
+      <w:pPr>
+        <w:numPr>
+          <w:ilvl w:val="0"/>
+          <w:numId w:val="12"/>
+        </w:numPr>
+      </w:pPr>
+      <w:r>
+        <w:t xml:space="preserve">Konfigurationsdateien definieren Frame-Timing, Samples, Chirps, Empfangskanäle und LVDS-Datenformat </w:t>
+      </w:r>
+    </w:p>
+    <w:p>
+      <w:pPr>
+        <w:numPr>
+          <w:ilvl w:val="0"/>
+          <w:numId w:val="12"/>
+        </w:numPr>
+      </w:pPr>
+      <w:r>
+        <w:t xml:space="preserve">Die Python-Pipeline benötigt diese Konfiguration, um die Daten korrekt zu rekonstruieren </w:t>
+      </w:r>
+    </w:p>
+    <w:p>
       <w:r>
         <w:t>Sprechernotizen:</w:t>
       </w:r>
       <w:r>
         <w:br/>
-        <w:t>Schließen Sie den Vortrag ab, indem Sie die gesamte Pipeline zusammenfassen. Das Projekt zeigt, wie rohe Radardaten zu kontaktlosen Vitalzeichen-Schätzungen verarbeitet werden können. Erwähnen Sie, dass das Dashboard lediglich die finale Darstellung des verarbeiteten Ergebnisses ist. Beenden Sie die Präsentation nicht nur mit einer Danke-Folie. Nutzen Sie diese Folie stattdessen, um den Hauptbeitrag noch einmal klar zu formulieren: eine vollständige Python-Verarbeitungskette von Radar-Rohdaten zu Atemfrequenz- und Herzfrequenz-Schätzungen.</w:t>
-      </w:r>
-    </w:p>
-    <w:p>
-      <w:r>
-        <w:pict w14:anchorId="26F32F2F">
-          <v:rect id="_x0000_i1126" style="width:0;height:1.5pt" o:hralign="center" o:hrstd="t" o:hr="t" fillcolor="#a0a0a0" stroked="f"/>
+        <w:t>Nutzen Sie diese Folie, wenn jemand nach dem Messaufbau oder der Entstehung der Rohdaten fragt. Der Messaufbau verwendete TI mmWave Studio zur Konfiguration des Radars und zur Aufzeichnung der rohen ADC-Daten. Der im Projekt verwendete Radar-IC war der TI IWR1843, und der rohe ADC-Datenstrom wurde mit der DCA1000EVM-Datenerfassungsplatine aufgezeichnet.</w:t>
+      </w:r>
+    </w:p>
+    <w:p>
+      <w:r>
+        <w:t>Der wichtige Punkt ist, dass Hardware und mmWave-Studio-Konfiguration notwendig sind, um nutzbare Messdaten zu erzeugen, aber nicht der eigene Hauptbeitrag des Projekts darstellen. Die Konfiguration definiert, wie die rohe Binärdatei interpretiert werden muss, einschließlich der Anzahl der Samples, Chirps, Frames, Empfangskanäle und des LVDS-Formats. Die Python-Pipeline nutzt diese Informationen, um die Rohaufzeichnung korrekt zu rekonstruieren, bevor die Signalverarbeitung beginnt.</w:t>
+      </w:r>
+    </w:p>
+    <w:p>
+      <w:r>
+        <w:pict w14:anchorId="5A65D658">
+          <v:rect id="_x0000_i1037" style="width:0;height:1.5pt" o:hralign="center" o:hrstd="t" o:hr="t" fillcolor="#a0a0a0" stroked="f"/>
         </w:pict>
       </w:r>
     </w:p>
@@ -3473,37 +3408,117 @@
           <w:b/>
           <w:bCs/>
         </w:rPr>
+        <w:t>Backup 2. Filterfrequenzbänder und Parameter</w:t>
+      </w:r>
+    </w:p>
+    <w:p>
+      <w:r>
+        <w:rPr>
+          <w:b/>
+          <w:bCs/>
+        </w:rPr>
+        <w:t>Warum diese Signalbereiche gewählt wurden</w:t>
+      </w:r>
+    </w:p>
+    <w:p>
+      <w:r>
+        <w:t>Stichpunkte:</w:t>
+      </w:r>
+    </w:p>
+    <w:p>
+      <w:pPr>
+        <w:numPr>
+          <w:ilvl w:val="0"/>
+          <w:numId w:val="13"/>
+        </w:numPr>
+      </w:pPr>
+      <w:r>
+        <w:t xml:space="preserve">Atmung erscheint in einem niedrigeren Bewegungsfrequenzband </w:t>
+      </w:r>
+    </w:p>
+    <w:p>
+      <w:pPr>
+        <w:numPr>
+          <w:ilvl w:val="0"/>
+          <w:numId w:val="13"/>
+        </w:numPr>
+      </w:pPr>
+      <w:r>
+        <w:t xml:space="preserve">Herzschlag erscheint in einem höheren Bewegungsfrequenzband </w:t>
+      </w:r>
+    </w:p>
+    <w:p>
+      <w:pPr>
+        <w:numPr>
+          <w:ilvl w:val="0"/>
+          <w:numId w:val="13"/>
+        </w:numPr>
+      </w:pPr>
+      <w:r>
+        <w:t xml:space="preserve">Bandpassfilter unterdrücken Drift, Rauschen und irrelevante Bewegungen </w:t>
+      </w:r>
+    </w:p>
+    <w:p>
+      <w:pPr>
+        <w:numPr>
+          <w:ilvl w:val="0"/>
+          <w:numId w:val="13"/>
+        </w:numPr>
+      </w:pPr>
+      <w:r>
         <w:lastRenderedPageBreak/>
-        <w:t>Backup</w:t>
-      </w:r>
-    </w:p>
-    <w:p>
-      <w:r>
-        <w:t>Diese Folien gehören nicht zur 12-Folien-Hauptpräsentation. Sie dienen nur zur Beantwortung möglicher Fragen nach dem Vortrag.</w:t>
-      </w:r>
-    </w:p>
-    <w:p>
-      <w:pPr>
-        <w:rPr>
-          <w:b/>
-          <w:bCs/>
-        </w:rPr>
-      </w:pPr>
-      <w:r>
-        <w:rPr>
-          <w:b/>
-          <w:bCs/>
-        </w:rPr>
-        <w:t>Backup 1. Radarkonfiguration und Datenerfassung</w:t>
-      </w:r>
-    </w:p>
-    <w:p>
-      <w:r>
-        <w:rPr>
-          <w:b/>
-          <w:bCs/>
-        </w:rPr>
-        <w:t>Wie die Messdaten aufgezeichnet wurden</w:t>
+        <w:t xml:space="preserve">Filterbereiche werden anhand plausibler physiologischer Frequenzen ausgewählt </w:t>
+      </w:r>
+    </w:p>
+    <w:p>
+      <w:pPr>
+        <w:numPr>
+          <w:ilvl w:val="0"/>
+          <w:numId w:val="13"/>
+        </w:numPr>
+      </w:pPr>
+      <w:r>
+        <w:t xml:space="preserve">Parameterwahl beeinflusst Empfindlichkeit und Fehlerrate </w:t>
+      </w:r>
+    </w:p>
+    <w:p>
+      <w:r>
+        <w:t>Sprechernotizen:</w:t>
+      </w:r>
+      <w:r>
+        <w:br/>
+        <w:t>Nutzen Sie diese Folie, wenn jemand fragt, warum genau diese Filterbereiche verwendet wurden. Die zentrale Erklärung ist, dass die Filter auf erwarteten physiologischen Frequenzbereichen basieren und nicht willkürlich gewählt sind. Atmung erscheint als niederfrequente Brustbewegung, während der Herzschlag als schwächere und schnellere Komponente erscheint. Die Filterbereiche werden daher so gewählt, dass nützliche physiologische Bewegung erhalten bleibt und irrelevante Signalanteile unterdrückt werden.</w:t>
+      </w:r>
+    </w:p>
+    <w:p>
+      <w:r>
+        <w:pict w14:anchorId="0FDCD79F">
+          <v:rect id="_x0000_i1038" style="width:0;height:1.5pt" o:hralign="center" o:hrstd="t" o:hr="t" fillcolor="#a0a0a0" stroked="f"/>
+        </w:pict>
+      </w:r>
+    </w:p>
+    <w:p>
+      <w:pPr>
+        <w:rPr>
+          <w:b/>
+          <w:bCs/>
+        </w:rPr>
+      </w:pPr>
+      <w:r>
+        <w:rPr>
+          <w:b/>
+          <w:bCs/>
+        </w:rPr>
+        <w:t>Backup 3. Validierungsmethode</w:t>
+      </w:r>
+    </w:p>
+    <w:p>
+      <w:r>
+        <w:rPr>
+          <w:b/>
+          <w:bCs/>
+        </w:rPr>
+        <w:t>Wie die Genauigkeit bewertet wurde</w:t>
       </w:r>
     </w:p>
     <w:p>
@@ -3515,120 +3530,55 @@
       <w:pPr>
         <w:numPr>
           <w:ilvl w:val="0"/>
-          <w:numId w:val="12"/>
-        </w:numPr>
-      </w:pPr>
-      <w:r>
-        <w:t xml:space="preserve">Radardaten wurden mit </w:t>
-      </w:r>
-      <w:r>
-        <w:rPr>
-          <w:b/>
-          <w:bCs/>
-        </w:rPr>
-        <w:t xml:space="preserve">TI </w:t>
-      </w:r>
-      <w:proofErr w:type="spellStart"/>
-      <w:r>
-        <w:rPr>
-          <w:b/>
-          <w:bCs/>
-        </w:rPr>
-        <w:t>mmWave</w:t>
-      </w:r>
-      <w:proofErr w:type="spellEnd"/>
-      <w:r>
-        <w:rPr>
-          <w:b/>
-          <w:bCs/>
-        </w:rPr>
-        <w:t xml:space="preserve"> Studio</w:t>
-      </w:r>
-      <w:r>
-        <w:t xml:space="preserve"> aufgezeichnet </w:t>
-      </w:r>
-    </w:p>
-    <w:p>
-      <w:pPr>
-        <w:numPr>
-          <w:ilvl w:val="0"/>
-          <w:numId w:val="12"/>
-        </w:numPr>
-      </w:pPr>
-      <w:r>
-        <w:t xml:space="preserve">Verwendeter Radar-IC im Projekt: </w:t>
-      </w:r>
-      <w:r>
-        <w:rPr>
-          <w:b/>
-          <w:bCs/>
-        </w:rPr>
-        <w:t>TI IWR1843</w:t>
-      </w:r>
-      <w:r>
-        <w:t xml:space="preserve"> </w:t>
-      </w:r>
-    </w:p>
-    <w:p>
-      <w:pPr>
-        <w:numPr>
-          <w:ilvl w:val="0"/>
-          <w:numId w:val="12"/>
-        </w:numPr>
-      </w:pPr>
-      <w:r>
-        <w:t xml:space="preserve">Verwendete Datenerfassungsplatine: </w:t>
-      </w:r>
-      <w:r>
-        <w:rPr>
-          <w:b/>
-          <w:bCs/>
-        </w:rPr>
-        <w:t>DCA1000EVM</w:t>
-      </w:r>
-      <w:r>
-        <w:t xml:space="preserve"> </w:t>
-      </w:r>
-    </w:p>
-    <w:p>
-      <w:pPr>
-        <w:numPr>
-          <w:ilvl w:val="0"/>
-          <w:numId w:val="12"/>
-        </w:numPr>
-      </w:pPr>
-      <w:r>
-        <w:t xml:space="preserve">Rohe ADC-Daten wurden für Offline-Verarbeitung gespeichert </w:t>
-      </w:r>
-    </w:p>
-    <w:p>
-      <w:pPr>
-        <w:numPr>
-          <w:ilvl w:val="0"/>
-          <w:numId w:val="12"/>
-        </w:numPr>
-      </w:pPr>
-      <w:r>
-        <w:t xml:space="preserve">Konfigurationsdateien definieren Frame-Timing, Samples, </w:t>
-      </w:r>
-      <w:proofErr w:type="spellStart"/>
-      <w:r>
-        <w:t>Chirps</w:t>
-      </w:r>
-      <w:proofErr w:type="spellEnd"/>
-      <w:r>
-        <w:t xml:space="preserve">, Empfangskanäle und LVDS-Datenformat </w:t>
-      </w:r>
-    </w:p>
-    <w:p>
-      <w:pPr>
-        <w:numPr>
-          <w:ilvl w:val="0"/>
-          <w:numId w:val="12"/>
-        </w:numPr>
-      </w:pPr>
-      <w:r>
-        <w:t xml:space="preserve">Die Python-Pipeline benötigt diese Konfiguration, um die Daten korrekt zu rekonstruieren </w:t>
+          <w:numId w:val="14"/>
+        </w:numPr>
+      </w:pPr>
+      <w:r>
+        <w:t xml:space="preserve">Radarschätzungen wurden mit unabhängigen Referenzwerten verglichen </w:t>
+      </w:r>
+    </w:p>
+    <w:p>
+      <w:pPr>
+        <w:numPr>
+          <w:ilvl w:val="0"/>
+          <w:numId w:val="14"/>
+        </w:numPr>
+      </w:pPr>
+      <w:r>
+        <w:t xml:space="preserve">Atmung und Herzfrequenz wurden getrennt bewertet </w:t>
+      </w:r>
+    </w:p>
+    <w:p>
+      <w:pPr>
+        <w:numPr>
+          <w:ilvl w:val="0"/>
+          <w:numId w:val="14"/>
+        </w:numPr>
+      </w:pPr>
+      <w:r>
+        <w:t xml:space="preserve">Der absolute Fehler wurde als intuitive Genauigkeitsmetrik verwendet </w:t>
+      </w:r>
+    </w:p>
+    <w:p>
+      <w:pPr>
+        <w:numPr>
+          <w:ilvl w:val="0"/>
+          <w:numId w:val="14"/>
+        </w:numPr>
+      </w:pPr>
+      <w:r>
+        <w:t xml:space="preserve">Atmung ist voraussichtlich zuverlässiger als Herzfrequenzschätzung </w:t>
+      </w:r>
+    </w:p>
+    <w:p>
+      <w:pPr>
+        <w:numPr>
+          <w:ilvl w:val="0"/>
+          <w:numId w:val="14"/>
+        </w:numPr>
+      </w:pPr>
+      <w:r>
+        <w:t xml:space="preserve">Mehr Validierungsaufnahmen würden die statistische Aussagekraft verbessern </w:t>
       </w:r>
     </w:p>
     <w:p>
@@ -3637,42 +3587,13 @@
       </w:r>
       <w:r>
         <w:br/>
-        <w:t xml:space="preserve">Nutzen Sie diese Folie, wenn jemand nach dem Messaufbau oder der Entstehung der Rohdaten fragt. Der Messaufbau verwendete TI </w:t>
-      </w:r>
-      <w:proofErr w:type="spellStart"/>
-      <w:r>
-        <w:t>mmWave</w:t>
-      </w:r>
-      <w:proofErr w:type="spellEnd"/>
-      <w:r>
-        <w:t xml:space="preserve"> Studio zur Konfiguration des Radars und zur Aufzeichnung der rohen ADC-Daten. Der im Projekt verwendete Radar-IC war der TI IWR1843, und der rohe ADC-Datenstrom wurde mit der DCA1000EVM-Datenerfassungsplatine aufgezeichnet.</w:t>
-      </w:r>
-    </w:p>
-    <w:p>
-      <w:r>
-        <w:t xml:space="preserve">Der wichtige Punkt ist, dass Hardware und </w:t>
-      </w:r>
-      <w:proofErr w:type="spellStart"/>
-      <w:r>
-        <w:t>mmWave</w:t>
-      </w:r>
-      <w:proofErr w:type="spellEnd"/>
-      <w:r>
-        <w:t xml:space="preserve">-Studio-Konfiguration notwendig sind, um nutzbare Messdaten zu erzeugen, aber nicht der eigene Hauptbeitrag des Projekts darstellen. Die Konfiguration definiert, wie die rohe Binärdatei interpretiert werden muss, einschließlich der Anzahl der Samples, </w:t>
-      </w:r>
-      <w:proofErr w:type="spellStart"/>
-      <w:r>
-        <w:t>Chirps</w:t>
-      </w:r>
-      <w:proofErr w:type="spellEnd"/>
-      <w:r>
-        <w:t>, Frames, Empfangskanäle und des LVDS-Formats. Die Python-Pipeline nutzt diese Informationen, um die Rohaufzeichnung korrekt zu rekonstruieren, bevor die Signalverarbeitung beginnt.</w:t>
-      </w:r>
-    </w:p>
-    <w:p>
-      <w:r>
-        <w:pict w14:anchorId="5A65D658">
-          <v:rect id="_x0000_i1127" style="width:0;height:1.5pt" o:hralign="center" o:hrstd="t" o:hr="t" fillcolor="#a0a0a0" stroked="f"/>
+        <w:t>Nutzen Sie diese Folie, wenn jemand fragt, wie zuverlässig die Ergebnisse sind. Betonen Sie, dass Validierung notwendig ist, weil der Algorithmus auch bei schlechter Signalqualität Zahlen erzeugen kann. Die Schätzungen sollten mit unabhängigen Referenzmessungen verglichen werden. Atmung und Herzfrequenz sollten getrennt bewertet werden, weil sie unterschiedliche Signalstärken und unterschiedliche Fehlerquellen haben.</w:t>
+      </w:r>
+    </w:p>
+    <w:p>
+      <w:r>
+        <w:pict w14:anchorId="2648A696">
+          <v:rect id="_x0000_i1039" style="width:0;height:1.5pt" o:hralign="center" o:hrstd="t" o:hr="t" fillcolor="#a0a0a0" stroked="f"/>
         </w:pict>
       </w:r>
     </w:p>
@@ -3688,16 +3609,16 @@
           <w:b/>
           <w:bCs/>
         </w:rPr>
-        <w:t>Backup 2. Filterfrequenzbänder und Parameter</w:t>
-      </w:r>
-    </w:p>
-    <w:p>
-      <w:r>
-        <w:rPr>
-          <w:b/>
-          <w:bCs/>
-        </w:rPr>
-        <w:t>Warum diese Signalbereiche gewählt wurden</w:t>
+        <w:t>Backup 4. Bekannte Grenzen und zukünftige Verbesserungen</w:t>
+      </w:r>
+    </w:p>
+    <w:p>
+      <w:r>
+        <w:rPr>
+          <w:b/>
+          <w:bCs/>
+        </w:rPr>
+        <w:t>Was das System als Nächstes verbessern würde</w:t>
       </w:r>
     </w:p>
     <w:p>
@@ -3709,55 +3630,55 @@
       <w:pPr>
         <w:numPr>
           <w:ilvl w:val="0"/>
-          <w:numId w:val="13"/>
-        </w:numPr>
-      </w:pPr>
-      <w:r>
-        <w:t xml:space="preserve">Atmung erscheint in einem niedrigeren Bewegungsfrequenzband </w:t>
-      </w:r>
-    </w:p>
-    <w:p>
-      <w:pPr>
-        <w:numPr>
-          <w:ilvl w:val="0"/>
-          <w:numId w:val="13"/>
-        </w:numPr>
-      </w:pPr>
-      <w:r>
-        <w:t xml:space="preserve">Herzschlag erscheint in einem höheren Bewegungsfrequenzband </w:t>
-      </w:r>
-    </w:p>
-    <w:p>
-      <w:pPr>
-        <w:numPr>
-          <w:ilvl w:val="0"/>
-          <w:numId w:val="13"/>
-        </w:numPr>
-      </w:pPr>
-      <w:r>
-        <w:t xml:space="preserve">Bandpassfilter unterdrücken Drift, Rauschen und irrelevante Bewegungen </w:t>
-      </w:r>
-    </w:p>
-    <w:p>
-      <w:pPr>
-        <w:numPr>
-          <w:ilvl w:val="0"/>
-          <w:numId w:val="13"/>
-        </w:numPr>
-      </w:pPr>
-      <w:r>
-        <w:t xml:space="preserve">Filterbereiche werden anhand plausibler physiologischer Frequenzen ausgewählt </w:t>
-      </w:r>
-    </w:p>
-    <w:p>
-      <w:pPr>
-        <w:numPr>
-          <w:ilvl w:val="0"/>
-          <w:numId w:val="13"/>
-        </w:numPr>
-      </w:pPr>
-      <w:r>
-        <w:t xml:space="preserve">Parameterwahl beeinflusst Empfindlichkeit und Fehlerrate </w:t>
+          <w:numId w:val="15"/>
+        </w:numPr>
+      </w:pPr>
+      <w:r>
+        <w:t xml:space="preserve">Robusteres Personentracking bei Bewegung </w:t>
+      </w:r>
+    </w:p>
+    <w:p>
+      <w:pPr>
+        <w:numPr>
+          <w:ilvl w:val="0"/>
+          <w:numId w:val="15"/>
+        </w:numPr>
+      </w:pPr>
+      <w:r>
+        <w:t xml:space="preserve">Verbesserte Unterdrückung von Körperbewegungsartefakten </w:t>
+      </w:r>
+    </w:p>
+    <w:p>
+      <w:pPr>
+        <w:numPr>
+          <w:ilvl w:val="0"/>
+          <w:numId w:val="15"/>
+        </w:numPr>
+      </w:pPr>
+      <w:r>
+        <w:t xml:space="preserve">Bessere Trennung von Atemharmonischen und Herzschlag </w:t>
+      </w:r>
+    </w:p>
+    <w:p>
+      <w:pPr>
+        <w:numPr>
+          <w:ilvl w:val="0"/>
+          <w:numId w:val="15"/>
+        </w:numPr>
+      </w:pPr>
+      <w:r>
+        <w:t xml:space="preserve">Größerer Validierungsdatensatz mit Referenzsensoren </w:t>
+      </w:r>
+    </w:p>
+    <w:p>
+      <w:pPr>
+        <w:numPr>
+          <w:ilvl w:val="0"/>
+          <w:numId w:val="15"/>
+        </w:numPr>
+      </w:pPr>
+      <w:r>
+        <w:t xml:space="preserve">Systematischere Tests über verschiedene Entfernungen, Winkel und Körperpositionen </w:t>
       </w:r>
     </w:p>
     <w:p>
@@ -3767,219 +3688,7 @@
       </w:r>
       <w:r>
         <w:br/>
-        <w:t>Nutzen Sie diese Folie, wenn jemand fragt, warum genau diese Filterbereiche verwendet wurden. Die zentrale Erklärung ist, dass die Filter auf erwarteten physiologischen Frequenzbereichen basieren und nicht willkürlich gewählt sind. Atmung erscheint als niederfrequente Brustbewegung, während der Herzschlag als schwächere und schnellere Komponente erscheint. Die Filterbereiche werden daher so gewählt, dass nützliche physiologische Bewegung erhalten bleibt und irrelevante Signalanteile unterdrückt werden.</w:t>
-      </w:r>
-    </w:p>
-    <w:p>
-      <w:r>
-        <w:pict w14:anchorId="0FDCD79F">
-          <v:rect id="_x0000_i1128" style="width:0;height:1.5pt" o:hralign="center" o:hrstd="t" o:hr="t" fillcolor="#a0a0a0" stroked="f"/>
-        </w:pict>
-      </w:r>
-    </w:p>
-    <w:p>
-      <w:pPr>
-        <w:rPr>
-          <w:b/>
-          <w:bCs/>
-        </w:rPr>
-      </w:pPr>
-      <w:r>
-        <w:rPr>
-          <w:b/>
-          <w:bCs/>
-        </w:rPr>
-        <w:t>Backup 3. Validierungsmethode</w:t>
-      </w:r>
-    </w:p>
-    <w:p>
-      <w:r>
-        <w:rPr>
-          <w:b/>
-          <w:bCs/>
-        </w:rPr>
-        <w:t>Wie die Genauigkeit bewertet wurde</w:t>
-      </w:r>
-    </w:p>
-    <w:p>
-      <w:r>
-        <w:t>Stichpunkte:</w:t>
-      </w:r>
-    </w:p>
-    <w:p>
-      <w:pPr>
-        <w:numPr>
-          <w:ilvl w:val="0"/>
-          <w:numId w:val="14"/>
-        </w:numPr>
-      </w:pPr>
-      <w:r>
-        <w:t xml:space="preserve">Radarschätzungen wurden mit unabhängigen Referenzwerten verglichen </w:t>
-      </w:r>
-    </w:p>
-    <w:p>
-      <w:pPr>
-        <w:numPr>
-          <w:ilvl w:val="0"/>
-          <w:numId w:val="14"/>
-        </w:numPr>
-      </w:pPr>
-      <w:r>
-        <w:t xml:space="preserve">Atmung und Herzfrequenz wurden getrennt bewertet </w:t>
-      </w:r>
-    </w:p>
-    <w:p>
-      <w:pPr>
-        <w:numPr>
-          <w:ilvl w:val="0"/>
-          <w:numId w:val="14"/>
-        </w:numPr>
-      </w:pPr>
-      <w:r>
-        <w:t xml:space="preserve">Der absolute Fehler wurde als intuitive Genauigkeitsmetrik verwendet </w:t>
-      </w:r>
-    </w:p>
-    <w:p>
-      <w:pPr>
-        <w:numPr>
-          <w:ilvl w:val="0"/>
-          <w:numId w:val="14"/>
-        </w:numPr>
-      </w:pPr>
-      <w:r>
-        <w:t xml:space="preserve">Atmung ist voraussichtlich zuverlässiger als Herzfrequenzschätzung </w:t>
-      </w:r>
-    </w:p>
-    <w:p>
-      <w:pPr>
-        <w:numPr>
-          <w:ilvl w:val="0"/>
-          <w:numId w:val="14"/>
-        </w:numPr>
-      </w:pPr>
-      <w:r>
-        <w:t xml:space="preserve">Mehr Validierungsaufnahmen würden die statistische Aussagekraft verbessern </w:t>
-      </w:r>
-    </w:p>
-    <w:p>
-      <w:r>
-        <w:t>Sprechernotizen:</w:t>
-      </w:r>
-      <w:r>
-        <w:br/>
-        <w:t>Nutzen Sie diese Folie, wenn jemand fragt, wie zuverlässig die Ergebnisse sind. Betonen Sie, dass Validierung notwendig ist, weil der Algorithmus auch bei schlechter Signalqualität Zahlen erzeugen kann. Die Schätzungen sollten mit unabhängigen Referenzmessungen verglichen werden. Atmung und Herzfrequenz sollten getrennt bewertet werden, weil sie unterschiedliche Signalstärken und unterschiedliche Fehlerquellen haben.</w:t>
-      </w:r>
-    </w:p>
-    <w:p>
-      <w:r>
-        <w:pict w14:anchorId="2648A696">
-          <v:rect id="_x0000_i1129" style="width:0;height:1.5pt" o:hralign="center" o:hrstd="t" o:hr="t" fillcolor="#a0a0a0" stroked="f"/>
-        </w:pict>
-      </w:r>
-    </w:p>
-    <w:p>
-      <w:pPr>
-        <w:rPr>
-          <w:b/>
-          <w:bCs/>
-        </w:rPr>
-      </w:pPr>
-      <w:r>
-        <w:rPr>
-          <w:b/>
-          <w:bCs/>
-        </w:rPr>
-        <w:t>Backup 4. Bekannte Grenzen und zukünftige Verbesserungen</w:t>
-      </w:r>
-    </w:p>
-    <w:p>
-      <w:r>
-        <w:rPr>
-          <w:b/>
-          <w:bCs/>
-        </w:rPr>
-        <w:t>Was das System als Nächstes verbessern würde</w:t>
-      </w:r>
-    </w:p>
-    <w:p>
-      <w:r>
-        <w:t>Stichpunkte:</w:t>
-      </w:r>
-    </w:p>
-    <w:p>
-      <w:pPr>
-        <w:numPr>
-          <w:ilvl w:val="0"/>
-          <w:numId w:val="15"/>
-        </w:numPr>
-      </w:pPr>
-      <w:r>
-        <w:t xml:space="preserve">Robusteres Personentracking bei Bewegung </w:t>
-      </w:r>
-    </w:p>
-    <w:p>
-      <w:pPr>
-        <w:numPr>
-          <w:ilvl w:val="0"/>
-          <w:numId w:val="15"/>
-        </w:numPr>
-      </w:pPr>
-      <w:r>
-        <w:t xml:space="preserve">Verbesserte Unterdrückung von Körperbewegungsartefakten </w:t>
-      </w:r>
-    </w:p>
-    <w:p>
-      <w:pPr>
-        <w:numPr>
-          <w:ilvl w:val="0"/>
-          <w:numId w:val="15"/>
-        </w:numPr>
-      </w:pPr>
-      <w:r>
-        <w:t xml:space="preserve">Bessere Trennung von Atemharmonischen und Herzschlag </w:t>
-      </w:r>
-    </w:p>
-    <w:p>
-      <w:pPr>
-        <w:numPr>
-          <w:ilvl w:val="0"/>
-          <w:numId w:val="15"/>
-        </w:numPr>
-      </w:pPr>
-      <w:r>
-        <w:t xml:space="preserve">Größerer Validierungsdatensatz mit Referenzsensoren </w:t>
-      </w:r>
-    </w:p>
-    <w:p>
-      <w:pPr>
-        <w:numPr>
-          <w:ilvl w:val="0"/>
-          <w:numId w:val="15"/>
-        </w:numPr>
-      </w:pPr>
-      <w:r>
-        <w:t xml:space="preserve">Systematischere Tests über verschiedene Entfernungen, Winkel und Körperpositionen </w:t>
-      </w:r>
-    </w:p>
-    <w:p>
-      <w:r>
-        <w:t>Sprechernotizen:</w:t>
-      </w:r>
-      <w:r>
-        <w:br/>
-        <w:t xml:space="preserve">Nutzen Sie diese Folie, wenn jemand nach zukünftiger Arbeit fragt. Die stärkste Antwort ist, dass die </w:t>
-      </w:r>
-      <w:r>
-        <w:lastRenderedPageBreak/>
-        <w:t xml:space="preserve">aktuelle Pipeline die Machbarkeit demonstriert, während der nächste Schritt eine robustere Validierung und bessere </w:t>
-      </w:r>
-      <w:proofErr w:type="spellStart"/>
-      <w:r>
-        <w:t>Artefaktbehandlung</w:t>
-      </w:r>
-      <w:proofErr w:type="spellEnd"/>
-      <w:r>
-        <w:t xml:space="preserve"> wäre. Das System sollte mit mehr Aufnahmen, unterschiedlichen Körperpositionen und zuverlässigen Referenzsensoren getestet werden, um Genauigkeit und Robustheit besser zu quantifizieren.</w:t>
+        <w:t>Nutzen Sie diese Folie, wenn jemand nach zukünftiger Arbeit fragt. Die stärkste Antwort ist, dass die aktuelle Pipeline die Machbarkeit demonstriert, während der nächste Schritt eine robustere Validierung und bessere Artefaktbehandlung wäre. Das System sollte mit mehr Aufnahmen, unterschiedlichen Körperpositionen und zuverlässigen Referenzsensoren getestet werden, um Genauigkeit und Robustheit besser zu quantifizieren.</w:t>
       </w:r>
     </w:p>
     <w:p/>
@@ -6880,6 +6589,7 @@
   <w:style w:type="character" w:default="1" w:styleId="Absatz-Standardschriftart">
     <w:name w:val="Default Paragraph Font"/>
     <w:uiPriority w:val="1"/>
+    <w:semiHidden/>
     <w:unhideWhenUsed/>
   </w:style>
   <w:style w:type="table" w:default="1" w:styleId="NormaleTabelle">

</xml_diff>